<commit_message>
Corrige CNPJ do Organizador
</commit_message>
<xml_diff>
--- a/template/template_avista.docx
+++ b/template/template_avista.docx
@@ -135,7 +135,14 @@
           <w:rFonts w:ascii="Arial" w:hAnsi="Arial" w:cs="Arial"/>
           <w:b/>
         </w:rPr>
-        <w:t>ALFAIATARIA DE IDEIAS LTDA</w:t>
+        <w:t>MEU EXAGERADO NEGOCIOS DE VAREJO</w:t>
+      </w:r>
+      <w:r>
+        <w:rPr>
+          <w:rFonts w:ascii="Arial" w:hAnsi="Arial" w:cs="Arial"/>
+          <w:b/>
+        </w:rPr>
+        <w:t xml:space="preserve"> LTDA</w:t>
       </w:r>
       <w:r>
         <w:rPr>
@@ -149,7 +156,31 @@
           <w:b/>
           <w:bCs/>
         </w:rPr>
-        <w:t>22.303.731/0001-49</w:t>
+        <w:t>31.132.191</w:t>
+      </w:r>
+      <w:r>
+        <w:rPr>
+          <w:rFonts w:ascii="Arial" w:hAnsi="Arial" w:cs="Arial"/>
+          <w:b/>
+          <w:bCs/>
+        </w:rPr>
+        <w:t>/0001-</w:t>
+      </w:r>
+      <w:r>
+        <w:rPr>
+          <w:rFonts w:ascii="Arial" w:hAnsi="Arial" w:cs="Arial"/>
+          <w:b/>
+          <w:bCs/>
+        </w:rPr>
+        <w:t>7</w:t>
+      </w:r>
+      <w:r>
+        <w:rPr>
+          <w:rFonts w:ascii="Arial" w:hAnsi="Arial" w:cs="Arial"/>
+          <w:b/>
+          <w:bCs/>
+        </w:rPr>
+        <w:t>9</w:t>
       </w:r>
       <w:r>
         <w:rPr>
@@ -157,11 +188,33 @@
         </w:rPr>
         <w:t xml:space="preserve">, com endereço na Rua </w:t>
       </w:r>
-      <w:r>
-        <w:rPr>
-          <w:rFonts w:ascii="Arial" w:hAnsi="Arial" w:cs="Arial"/>
-        </w:rPr>
-        <w:t>Braulina Baptista Lopes, 150, Edíficio, Rosario de Fátima, SERRA/ES. CEP: 29161-121</w:t>
+      <w:proofErr w:type="spellStart"/>
+      <w:r>
+        <w:rPr>
+          <w:rFonts w:ascii="Arial" w:hAnsi="Arial" w:cs="Arial"/>
+        </w:rPr>
+        <w:t>Braulina</w:t>
+      </w:r>
+      <w:proofErr w:type="spellEnd"/>
+      <w:r>
+        <w:rPr>
+          <w:rFonts w:ascii="Arial" w:hAnsi="Arial" w:cs="Arial"/>
+        </w:rPr>
+        <w:t xml:space="preserve"> Baptista Lopes, 150, </w:t>
+      </w:r>
+      <w:proofErr w:type="spellStart"/>
+      <w:r>
+        <w:rPr>
+          <w:rFonts w:ascii="Arial" w:hAnsi="Arial" w:cs="Arial"/>
+        </w:rPr>
+        <w:t>Edíficio</w:t>
+      </w:r>
+      <w:proofErr w:type="spellEnd"/>
+      <w:r>
+        <w:rPr>
+          <w:rFonts w:ascii="Arial" w:hAnsi="Arial" w:cs="Arial"/>
+        </w:rPr>
+        <w:t>, Rosario de Fátima, SERRA/ES. CEP: 29161-121</w:t>
       </w:r>
       <w:r>
         <w:rPr>
@@ -2727,12 +2780,14 @@
         </w:rPr>
         <w:t xml:space="preserve"> </w:t>
       </w:r>
+      <w:proofErr w:type="spellStart"/>
       <w:r>
         <w:rPr>
           <w:rFonts w:ascii="Arial" w:hAnsi="Arial" w:cs="Arial"/>
         </w:rPr>
         <w:t>Code</w:t>
       </w:r>
+      <w:proofErr w:type="spellEnd"/>
       <w:r>
         <w:rPr>
           <w:rFonts w:ascii="Arial" w:hAnsi="Arial" w:cs="Arial"/>
@@ -5921,7 +5976,21 @@
         <w:rPr>
           <w:rFonts w:ascii="Arial" w:hAnsi="Arial" w:cs="Arial"/>
         </w:rPr>
-        <w:t>a) Taxa técnica (infraestrutura elétrica, hidráulica, ou similar);</w:t>
+        <w:t xml:space="preserve">a) Taxa técnica (infraestrutura elétrica, </w:t>
+      </w:r>
+      <w:proofErr w:type="gramStart"/>
+      <w:r>
+        <w:rPr>
+          <w:rFonts w:ascii="Arial" w:hAnsi="Arial" w:cs="Arial"/>
+        </w:rPr>
+        <w:t>hidráulica, ou similar</w:t>
+      </w:r>
+      <w:proofErr w:type="gramEnd"/>
+      <w:r>
+        <w:rPr>
+          <w:rFonts w:ascii="Arial" w:hAnsi="Arial" w:cs="Arial"/>
+        </w:rPr>
+        <w:t>);</w:t>
       </w:r>
     </w:p>
     <w:p>
@@ -6418,7 +6487,23 @@
           <w:rFonts w:ascii="Arial" w:hAnsi="Arial" w:cs="Arial"/>
           <w:color w:val="000000" w:themeColor="text1"/>
         </w:rPr>
-        <w:t xml:space="preserve"> e o evento parceiro I Love Bazar, realizado por Letícia Scheletz.</w:t>
+        <w:t xml:space="preserve"> e o evento parceiro I Love Bazar, realizado por Letícia </w:t>
+      </w:r>
+      <w:proofErr w:type="spellStart"/>
+      <w:r>
+        <w:rPr>
+          <w:rFonts w:ascii="Arial" w:hAnsi="Arial" w:cs="Arial"/>
+          <w:color w:val="000000" w:themeColor="text1"/>
+        </w:rPr>
+        <w:t>Scheletz</w:t>
+      </w:r>
+      <w:proofErr w:type="spellEnd"/>
+      <w:r>
+        <w:rPr>
+          <w:rFonts w:ascii="Arial" w:hAnsi="Arial" w:cs="Arial"/>
+          <w:color w:val="000000" w:themeColor="text1"/>
+        </w:rPr>
+        <w:t>.</w:t>
       </w:r>
     </w:p>
     <w:p>
@@ -6806,7 +6891,35 @@
         <w:rPr>
           <w:rFonts w:ascii="Arial" w:hAnsi="Arial" w:cs="Arial"/>
         </w:rPr>
-        <w:t>", todas e quaisquer informações e/ou dados de natureza confidencial (incluindo, sem limitação, os termos e condições deste instrumento e todos os segredos e/ou informações operacionais, patenteada ou não, de natureza técnica, operacional, econômica, de mercado, comercial, jurídica, contábil, societária, tributária, planos de negócios, invenções, processos e fórmulas, know how, designs, algoritmos, projetos, protocolos de procedimento, esboços, fotografias, plantas, desenhos, conceitos de produtos, especificações, amostras, relatórios, ideias, nomes de clientes, vendedores e/ou distribuidoras, informações de preços, dentre outras, as informações orais e escritas, reveladas, colocadas à disposição, cujo acesso tenha sido permitido, transmitidas e/ou divulgadas a</w:t>
+        <w:t xml:space="preserve">", todas e quaisquer informações e/ou dados de natureza confidencial (incluindo, sem limitação, os termos e condições deste instrumento e todos os segredos e/ou informações operacionais, patenteada ou não, de natureza técnica, operacional, econômica, de mercado, comercial, jurídica, contábil, societária, tributária, planos de negócios, invenções, processos e fórmulas, </w:t>
+      </w:r>
+      <w:proofErr w:type="spellStart"/>
+      <w:r>
+        <w:rPr>
+          <w:rFonts w:ascii="Arial" w:hAnsi="Arial" w:cs="Arial"/>
+        </w:rPr>
+        <w:t>know</w:t>
+      </w:r>
+      <w:proofErr w:type="spellEnd"/>
+      <w:r>
+        <w:rPr>
+          <w:rFonts w:ascii="Arial" w:hAnsi="Arial" w:cs="Arial"/>
+        </w:rPr>
+        <w:t xml:space="preserve"> </w:t>
+      </w:r>
+      <w:proofErr w:type="spellStart"/>
+      <w:r>
+        <w:rPr>
+          <w:rFonts w:ascii="Arial" w:hAnsi="Arial" w:cs="Arial"/>
+        </w:rPr>
+        <w:t>how</w:t>
+      </w:r>
+      <w:proofErr w:type="spellEnd"/>
+      <w:r>
+        <w:rPr>
+          <w:rFonts w:ascii="Arial" w:hAnsi="Arial" w:cs="Arial"/>
+        </w:rPr>
+        <w:t>, designs, algoritmos, projetos, protocolos de procedimento, esboços, fotografias, plantas, desenhos, conceitos de produtos, especificações, amostras, relatórios, ideias, nomes de clientes, vendedores e/ou distribuidoras, informações de preços, dentre outras, as informações orais e escritas, reveladas, colocadas à disposição, cujo acesso tenha sido permitido, transmitidas e/ou divulgadas a</w:t>
       </w:r>
       <w:r>
         <w:rPr>
@@ -6874,6 +6987,7 @@
         </w:rPr>
         <w:t>úblico, ou (ii) se tornaram conhecidas do público, em caráter geral, ap</w:t>
       </w:r>
+      <w:proofErr w:type="spellStart"/>
       <w:r>
         <w:rPr>
           <w:rFonts w:ascii="Arial" w:hAnsi="Arial" w:cs="Arial"/>
@@ -6881,6 +6995,7 @@
         </w:rPr>
         <w:t>ó</w:t>
       </w:r>
+      <w:proofErr w:type="spellEnd"/>
       <w:r>
         <w:rPr>
           <w:rFonts w:ascii="Arial" w:hAnsi="Arial" w:cs="Arial"/>
@@ -6895,6 +7010,7 @@
         </w:rPr>
         <w:t>blico ap</w:t>
       </w:r>
+      <w:proofErr w:type="spellStart"/>
       <w:r>
         <w:rPr>
           <w:rFonts w:ascii="Arial" w:hAnsi="Arial" w:cs="Arial"/>
@@ -6902,6 +7018,7 @@
         </w:rPr>
         <w:t>ó</w:t>
       </w:r>
+      <w:proofErr w:type="spellEnd"/>
       <w:r>
         <w:rPr>
           <w:rFonts w:ascii="Arial" w:hAnsi="Arial" w:cs="Arial"/>
@@ -9353,6 +9470,30 @@
 </file>
 
 <file path=customXml/item1.xml><?xml version="1.0" encoding="utf-8"?>
+<p:properties xmlns:p="http://schemas.microsoft.com/office/2006/metadata/properties" xmlns:xsi="http://www.w3.org/2001/XMLSchema-instance" xmlns:pc="http://schemas.microsoft.com/office/infopath/2007/PartnerControls">
+  <documentManagement>
+    <lcf76f155ced4ddcb4097134ff3c332f xmlns="b0abdc7c-b81f-47c0-8d37-e53421c16be1">
+      <Terms xmlns="http://schemas.microsoft.com/office/infopath/2007/PartnerControls"/>
+    </lcf76f155ced4ddcb4097134ff3c332f>
+    <TaxCatchAll xmlns="9b67fadb-89b0-45c3-8622-359d5aab3ac5" xsi:nil="true"/>
+  </documentManagement>
+</p:properties>
+</file>
+
+<file path=customXml/item2.xml><?xml version="1.0" encoding="utf-8"?>
+<?mso-contentType ?>
+<FormTemplates xmlns="http://schemas.microsoft.com/sharepoint/v3/contenttype/forms">
+  <Display>DocumentLibraryForm</Display>
+  <Edit>DocumentLibraryForm</Edit>
+  <New>DocumentLibraryForm</New>
+</FormTemplates>
+</file>
+
+<file path=customXml/item3.xml><?xml version="1.0" encoding="utf-8"?>
+<b:Sources xmlns:b="http://schemas.openxmlformats.org/officeDocument/2006/bibliography" xmlns="http://schemas.openxmlformats.org/officeDocument/2006/bibliography" SelectedStyle="\APA.XSL" StyleName="APA"/>
+</file>
+
+<file path=customXml/item4.xml><?xml version="1.0" encoding="utf-8"?>
 <ct:contentTypeSchema xmlns:ct="http://schemas.microsoft.com/office/2006/metadata/contentType" xmlns:ma="http://schemas.microsoft.com/office/2006/metadata/properties/metaAttributes" ct:_="" ma:_="" ma:contentTypeName="Documento" ma:contentTypeID="0x0101002F459F8D9828F745BE3B954ADB74309D" ma:contentTypeVersion="21" ma:contentTypeDescription="Crie um novo documento." ma:contentTypeScope="" ma:versionID="55daba8387c0a35d8e229400967f3b37">
   <xsd:schema xmlns:xsd="http://www.w3.org/2001/XMLSchema" xmlns:xs="http://www.w3.org/2001/XMLSchema" xmlns:p="http://schemas.microsoft.com/office/2006/metadata/properties" xmlns:ns2="b0abdc7c-b81f-47c0-8d37-e53421c16be1" xmlns:ns3="9b67fadb-89b0-45c3-8622-359d5aab3ac5" targetNamespace="http://schemas.microsoft.com/office/2006/metadata/properties" ma:root="true" ma:fieldsID="eb0d4114bff1126495d943ab6a7be351" ns2:_="" ns3:_="">
     <xsd:import namespace="b0abdc7c-b81f-47c0-8d37-e53421c16be1"/>
@@ -9613,31 +9754,34 @@
 </ct:contentTypeSchema>
 </file>
 
-<file path=customXml/item2.xml><?xml version="1.0" encoding="utf-8"?>
-<b:Sources xmlns:b="http://schemas.openxmlformats.org/officeDocument/2006/bibliography" xmlns="http://schemas.openxmlformats.org/officeDocument/2006/bibliography" SelectedStyle="\APA.XSL" StyleName="APA"/>
+<file path=customXml/itemProps1.xml><?xml version="1.0" encoding="utf-8"?>
+<ds:datastoreItem xmlns:ds="http://schemas.openxmlformats.org/officeDocument/2006/customXml" ds:itemID="{9D374E39-0C21-4940-9679-7C1E21D9F5E5}">
+  <ds:schemaRefs>
+    <ds:schemaRef ds:uri="http://schemas.microsoft.com/office/2006/metadata/properties"/>
+    <ds:schemaRef ds:uri="http://schemas.microsoft.com/office/infopath/2007/PartnerControls"/>
+    <ds:schemaRef ds:uri="b0abdc7c-b81f-47c0-8d37-e53421c16be1"/>
+    <ds:schemaRef ds:uri="9b67fadb-89b0-45c3-8622-359d5aab3ac5"/>
+  </ds:schemaRefs>
+</ds:datastoreItem>
 </file>
 
-<file path=customXml/item3.xml><?xml version="1.0" encoding="utf-8"?>
-<?mso-contentType ?>
-<FormTemplates xmlns="http://schemas.microsoft.com/sharepoint/v3/contenttype/forms">
-  <Display>DocumentLibraryForm</Display>
-  <Edit>DocumentLibraryForm</Edit>
-  <New>DocumentLibraryForm</New>
-</FormTemplates>
+<file path=customXml/itemProps2.xml><?xml version="1.0" encoding="utf-8"?>
+<ds:datastoreItem xmlns:ds="http://schemas.openxmlformats.org/officeDocument/2006/customXml" ds:itemID="{A8FDF9CD-DFE0-42B0-AA86-9CEEF4645DEB}">
+  <ds:schemaRefs>
+    <ds:schemaRef ds:uri="http://schemas.microsoft.com/sharepoint/v3/contenttype/forms"/>
+  </ds:schemaRefs>
+</ds:datastoreItem>
 </file>
 
-<file path=customXml/item4.xml><?xml version="1.0" encoding="utf-8"?>
-<p:properties xmlns:p="http://schemas.microsoft.com/office/2006/metadata/properties" xmlns:xsi="http://www.w3.org/2001/XMLSchema-instance" xmlns:pc="http://schemas.microsoft.com/office/infopath/2007/PartnerControls">
-  <documentManagement>
-    <lcf76f155ced4ddcb4097134ff3c332f xmlns="b0abdc7c-b81f-47c0-8d37-e53421c16be1">
-      <Terms xmlns="http://schemas.microsoft.com/office/infopath/2007/PartnerControls"/>
-    </lcf76f155ced4ddcb4097134ff3c332f>
-    <TaxCatchAll xmlns="9b67fadb-89b0-45c3-8622-359d5aab3ac5" xsi:nil="true"/>
-  </documentManagement>
-</p:properties>
+<file path=customXml/itemProps3.xml><?xml version="1.0" encoding="utf-8"?>
+<ds:datastoreItem xmlns:ds="http://schemas.openxmlformats.org/officeDocument/2006/customXml" ds:itemID="{7FB1261D-80BE-4784-8631-7621A184C5A6}">
+  <ds:schemaRefs>
+    <ds:schemaRef ds:uri="http://schemas.openxmlformats.org/officeDocument/2006/bibliography"/>
+  </ds:schemaRefs>
+</ds:datastoreItem>
 </file>
 
-<file path=customXml/itemProps1.xml><?xml version="1.0" encoding="utf-8"?>
+<file path=customXml/itemProps4.xml><?xml version="1.0" encoding="utf-8"?>
 <ds:datastoreItem xmlns:ds="http://schemas.openxmlformats.org/officeDocument/2006/customXml" ds:itemID="{BDF49FED-13BF-4798-B66E-9D4BDE11D6C6}">
   <ds:schemaRefs>
     <ds:schemaRef ds:uri="http://schemas.microsoft.com/office/2006/metadata/contentType"/>
@@ -9654,31 +9798,4 @@
     <ds:schemaRef ds:uri="http://schemas.microsoft.com/internal/obd"/>
   </ds:schemaRefs>
 </ds:datastoreItem>
-</file>
-
-<file path=customXml/itemProps2.xml><?xml version="1.0" encoding="utf-8"?>
-<ds:datastoreItem xmlns:ds="http://schemas.openxmlformats.org/officeDocument/2006/customXml" ds:itemID="{7FB1261D-80BE-4784-8631-7621A184C5A6}">
-  <ds:schemaRefs>
-    <ds:schemaRef ds:uri="http://schemas.openxmlformats.org/officeDocument/2006/bibliography"/>
-  </ds:schemaRefs>
-</ds:datastoreItem>
-</file>
-
-<file path=customXml/itemProps3.xml><?xml version="1.0" encoding="utf-8"?>
-<ds:datastoreItem xmlns:ds="http://schemas.openxmlformats.org/officeDocument/2006/customXml" ds:itemID="{A8FDF9CD-DFE0-42B0-AA86-9CEEF4645DEB}">
-  <ds:schemaRefs>
-    <ds:schemaRef ds:uri="http://schemas.microsoft.com/sharepoint/v3/contenttype/forms"/>
-  </ds:schemaRefs>
-</ds:datastoreItem>
-</file>
-
-<file path=customXml/itemProps4.xml><?xml version="1.0" encoding="utf-8"?>
-<ds:datastoreItem xmlns:ds="http://schemas.openxmlformats.org/officeDocument/2006/customXml" ds:itemID="{9D374E39-0C21-4940-9679-7C1E21D9F5E5}">
-  <ds:schemaRefs>
-    <ds:schemaRef ds:uri="http://schemas.microsoft.com/office/2006/metadata/properties"/>
-    <ds:schemaRef ds:uri="http://schemas.microsoft.com/office/infopath/2007/PartnerControls"/>
-    <ds:schemaRef ds:uri="b0abdc7c-b81f-47c0-8d37-e53421c16be1"/>
-    <ds:schemaRef ds:uri="9b67fadb-89b0-45c3-8622-359d5aab3ac5"/>
-  </ds:schemaRefs>
-</ds:datastoreItem>
 </file>
</xml_diff>